<commit_message>
scripts: add gen_paper_figures.py — regenerate fig4-8 from result CSVs
</commit_message>
<xml_diff>
--- a/docs/paper/paper_v2.docx
+++ b/docs/paper/paper_v2.docx
@@ -3311,7 +3311,7 @@
       <w:r>
         <w:drawing>
           <wp:inline>
-            <wp:extent cx="5334000" cy="2051538"/>
+            <wp:extent cx="5334000" cy="2286000"/>
             <wp:effectExtent b="0" l="0" r="0" t="0"/>
             <wp:docPr descr="Figure 6. Cross-era transaction volume at fixed 10,000-block windows. Left: external transactions per block rise from ~8 (2016) to 130–188 in the modern eras (densification). Right: the internal-to-external transaction ratio jumps from 0.20 (2016, 2020) to ~0.57 after the Merge (rising smart-contract complexity)." title="" id="30" name="Picture"/>
             <a:graphic>
@@ -3332,7 +3332,7 @@
                   <pic:spPr bwMode="auto">
                     <a:xfrm>
                       <a:off x="0" y="0"/>
-                      <a:ext cx="5334000" cy="2051538"/>
+                      <a:ext cx="5334000" cy="2286000"/>
                     </a:xfrm>
                     <a:prstGeom prst="rect">
                       <a:avLst/>

</xml_diff>

<commit_message>
paper: add Code and data availability statement (GitHub repo)
</commit_message>
<xml_diff>
--- a/docs/paper/paper_v2.docx
+++ b/docs/paper/paper_v2.docx
@@ -28,7 +28,7 @@
         </w:p>
       </w:sdtContent>
     </w:sdt>
-    <w:bookmarkStart w:id="56" w:name="X63549e08055b657ccf82a95e21665ce445d9073"/>
+    <w:bookmarkStart w:id="58" w:name="X63549e08055b657ccf82a95e21665ce445d9073"/>
     <w:p>
       <w:pPr>
         <w:pStyle w:val="Heading1"/>
@@ -5225,7 +5225,78 @@
       </w:r>
     </w:p>
     <w:bookmarkEnd w:id="47"/>
-    <w:bookmarkStart w:id="48" w:name="references"/>
+    <w:bookmarkStart w:id="49" w:name="code-and-data-availability"/>
+    <w:p>
+      <w:pPr>
+        <w:pStyle w:val="Heading2"/>
+      </w:pPr>
+      <w:r>
+        <w:t xml:space="preserve">Code and data availability</w:t>
+      </w:r>
+    </w:p>
+    <w:p>
+      <w:pPr>
+        <w:pStyle w:val="FirstParagraph"/>
+      </w:pPr>
+      <w:r>
+        <w:t xml:space="preserve">The complete implementation — the graph schema, the BigQuery ingestion pipeline,</w:t>
+      </w:r>
+      <w:r>
+        <w:t xml:space="preserve"> </w:t>
+      </w:r>
+      <w:r>
+        <w:t xml:space="preserve">the fourteen analytical queries, and the scripts that regenerate every figure and</w:t>
+      </w:r>
+      <w:r>
+        <w:t xml:space="preserve"> </w:t>
+      </w:r>
+      <w:r>
+        <w:t xml:space="preserve">table in this paper — is openly available at</w:t>
+      </w:r>
+      <w:r>
+        <w:t xml:space="preserve"> </w:t>
+      </w:r>
+      <w:hyperlink r:id="rId48">
+        <w:r>
+          <w:rPr>
+            <w:rStyle w:val="Hyperlink"/>
+          </w:rPr>
+          <w:t xml:space="preserve">https://github.com/jmejiaes/neo4j_ether</w:t>
+        </w:r>
+      </w:hyperlink>
+      <w:r>
+        <w:t xml:space="preserve">. All results are reproducible from the</w:t>
+      </w:r>
+      <w:r>
+        <w:t xml:space="preserve"> </w:t>
+      </w:r>
+      <w:r>
+        <w:t xml:space="preserve">public</w:t>
+      </w:r>
+      <w:r>
+        <w:t xml:space="preserve"> </w:t>
+      </w:r>
+      <w:r>
+        <w:rPr>
+          <w:rStyle w:val="VerbatimChar"/>
+        </w:rPr>
+        <w:t xml:space="preserve">bigquery-public-data.crypto_ethereum</w:t>
+      </w:r>
+      <w:r>
+        <w:t xml:space="preserve"> </w:t>
+      </w:r>
+      <w:r>
+        <w:t xml:space="preserve">dataset; the repository documents the</w:t>
+      </w:r>
+      <w:r>
+        <w:t xml:space="preserve"> </w:t>
+      </w:r>
+      <w:r>
+        <w:t xml:space="preserve">block windows, the cumulative block-count ladder, and the eras used.</w:t>
+      </w:r>
+    </w:p>
+    <w:bookmarkEnd w:id="49"/>
+    <w:bookmarkStart w:id="50" w:name="references"/>
     <w:p>
       <w:pPr>
         <w:pStyle w:val="Heading2"/>
@@ -5337,8 +5408,8 @@
         <w:t xml:space="preserve">ETL), used for all data acquisition in Section 4.</w:t>
       </w:r>
     </w:p>
-    <w:bookmarkEnd w:id="48"/>
-    <w:bookmarkStart w:id="55" w:name="appendix-a-result-tables"/>
+    <w:bookmarkEnd w:id="50"/>
+    <w:bookmarkStart w:id="57" w:name="appendix-a-result-tables"/>
     <w:p>
       <w:pPr>
         <w:pStyle w:val="Heading2"/>
@@ -5390,7 +5461,7 @@
         <w:t xml:space="preserve">The ETH totals in Tables A.1 and A.6 sum external-transaction value and internal-transaction amount over incoming edges, so ETH forwarded through a contract may be counted at more than one hop; these tables are intended for ranking, not exact fund accounting.</w:t>
       </w:r>
     </w:p>
-    <w:bookmarkStart w:id="49" w:name="X214d4ec02ec74041553deb549fd11790b2703f8"/>
+    <w:bookmarkStart w:id="51" w:name="X214d4ec02ec74041553deb549fd11790b2703f8"/>
     <w:p>
       <w:pPr>
         <w:pStyle w:val="Heading3"/>
@@ -6076,8 +6147,8 @@
         </w:tc>
       </w:tr>
     </w:tbl>
-    <w:bookmarkEnd w:id="49"/>
-    <w:bookmarkStart w:id="50" w:name="X5863678dbf673f417b0f3fae876c6fc79abdeac"/>
+    <w:bookmarkEnd w:id="51"/>
+    <w:bookmarkStart w:id="52" w:name="X5863678dbf673f417b0f3fae876c6fc79abdeac"/>
     <w:p>
       <w:pPr>
         <w:pStyle w:val="Heading3"/>
@@ -6774,8 +6845,8 @@
         </w:tc>
       </w:tr>
     </w:tbl>
-    <w:bookmarkEnd w:id="50"/>
-    <w:bookmarkStart w:id="51" w:name="X7d84aa2e0b2b54693ba43a4ccbab22deed22e9e"/>
+    <w:bookmarkEnd w:id="52"/>
+    <w:bookmarkStart w:id="53" w:name="X7d84aa2e0b2b54693ba43a4ccbab22deed22e9e"/>
     <w:p>
       <w:pPr>
         <w:pStyle w:val="Heading3"/>
@@ -7405,8 +7476,8 @@
         </w:tc>
       </w:tr>
     </w:tbl>
-    <w:bookmarkEnd w:id="51"/>
-    <w:bookmarkStart w:id="52" w:name="X145395819cc267584b954e33b6206b843e06e16"/>
+    <w:bookmarkEnd w:id="53"/>
+    <w:bookmarkStart w:id="54" w:name="X145395819cc267584b954e33b6206b843e06e16"/>
     <w:p>
       <w:pPr>
         <w:pStyle w:val="Heading3"/>
@@ -8036,8 +8107,8 @@
         </w:tc>
       </w:tr>
     </w:tbl>
-    <w:bookmarkEnd w:id="52"/>
-    <w:bookmarkStart w:id="53" w:name="X8aa201537f882d17bb999ec593b8110b2f44bac"/>
+    <w:bookmarkEnd w:id="54"/>
+    <w:bookmarkStart w:id="55" w:name="X8aa201537f882d17bb999ec593b8110b2f44bac"/>
     <w:p>
       <w:pPr>
         <w:pStyle w:val="Heading3"/>
@@ -8724,8 +8795,8 @@
         </w:tc>
       </w:tr>
     </w:tbl>
-    <w:bookmarkEnd w:id="53"/>
-    <w:bookmarkStart w:id="54" w:name="X82d7506a9cdc605ac13e50261740acac4f65c3d"/>
+    <w:bookmarkEnd w:id="55"/>
+    <w:bookmarkStart w:id="56" w:name="X82d7506a9cdc605ac13e50261740acac4f65c3d"/>
     <w:p>
       <w:pPr>
         <w:pStyle w:val="Heading3"/>
@@ -9100,9 +9171,9 @@
         </w:tc>
       </w:tr>
     </w:tbl>
-    <w:bookmarkEnd w:id="54"/>
-    <w:bookmarkEnd w:id="55"/>
     <w:bookmarkEnd w:id="56"/>
+    <w:bookmarkEnd w:id="57"/>
+    <w:bookmarkEnd w:id="58"/>
     <w:sectPr>
       <w:footnotePr>
         <w:numRestart w:val="eachSect"/>

</xml_diff>

<commit_message>
paper: restore conceptual figures (1-3), Table 1, and full references
- fig1-3 recreated with Graphviz (gen_model_figures.py), consistent with the
  current model (accounts carry address/isContract only, no balance)
- Table 1 (summary of analyzed works) added to related work
- References expanded from placeholder to 14 formatted entries with DOIs;
  add Tschorsch & Scheuermann (2016) and cite Said/Kiffer/Victor & Weintraud
</commit_message>
<xml_diff>
--- a/docs/paper/paper_v2.docx
+++ b/docs/paper/paper_v2.docx
@@ -28,7 +28,7 @@
         </w:p>
       </w:sdtContent>
     </w:sdt>
-    <w:bookmarkStart w:id="58" w:name="X63549e08055b657ccf82a95e21665ce445d9073"/>
+    <w:bookmarkStart w:id="78" w:name="X63549e08055b657ccf82a95e21665ce445d9073"/>
     <w:p>
       <w:pPr>
         <w:pStyle w:val="Heading1"/>
@@ -857,6 +857,44 @@
         <w:t xml:space="preserve">prediction, outperforming traditional random-walk techniques on real Ethereum data.</w:t>
       </w:r>
     </w:p>
+    <w:p>
+      <w:pPr>
+        <w:pStyle w:val="BodyText"/>
+      </w:pPr>
+      <w:r>
+        <w:t xml:space="preserve">Other studies analyse Ethereum activity for specific phenomena rather than proposing</w:t>
+      </w:r>
+      <w:r>
+        <w:t xml:space="preserve"> </w:t>
+      </w:r>
+      <w:r>
+        <w:t xml:space="preserve">a general analytical model: Said et al. (2021) characterise transaction behaviour,</w:t>
+      </w:r>
+      <w:r>
+        <w:t xml:space="preserve"> </w:t>
+      </w:r>
+      <w:r>
+        <w:t xml:space="preserve">community structure, and link prediction across the network; Kiffer et al. (2018)</w:t>
+      </w:r>
+      <w:r>
+        <w:t xml:space="preserve"> </w:t>
+      </w:r>
+      <w:r>
+        <w:t xml:space="preserve">study the smart-contract ecosystem and contract creation/interaction patterns; and</w:t>
+      </w:r>
+      <w:r>
+        <w:t xml:space="preserve"> </w:t>
+      </w:r>
+      <w:r>
+        <w:t xml:space="preserve">Victor &amp; Weintraud (2021) detect and quantify wash trading on decentralized</w:t>
+      </w:r>
+      <w:r>
+        <w:t xml:space="preserve"> </w:t>
+      </w:r>
+      <w:r>
+        <w:t xml:space="preserve">exchanges.</w:t>
+      </w:r>
+    </w:p>
     <w:bookmarkEnd w:id="12"/>
     <w:bookmarkStart w:id="13" w:name="positioning"/>
     <w:p>
@@ -929,9 +967,393 @@
         <w:t xml:space="preserve">across four eras. Table 1 summarizes the analyzed works and their limitations.</w:t>
       </w:r>
     </w:p>
+    <w:p>
+      <w:pPr>
+        <w:pStyle w:val="BodyText"/>
+      </w:pPr>
+      <w:r>
+        <w:rPr>
+          <w:b/>
+          <w:bCs/>
+        </w:rPr>
+        <w:t xml:space="preserve">Table 1.</w:t>
+      </w:r>
+      <w:r>
+        <w:t xml:space="preserve"> </w:t>
+      </w:r>
+      <w:r>
+        <w:t xml:space="preserve">Summary of the analyzed works.</w:t>
+      </w:r>
+    </w:p>
+    <w:tbl>
+      <w:tblPr>
+        <w:tblStyle w:val="Table"/>
+        <w:tblW w:type="pct" w:w="5000"/>
+        <w:tblLayout w:type="fixed"/>
+        <w:tblLook w:firstRow="1" w:lastRow="0" w:firstColumn="0" w:lastColumn="0" w:noHBand="0" w:noVBand="0" w:val="0020"/>
+      </w:tblPr>
+      <w:tblGrid>
+        <w:gridCol w:w="2354"/>
+        <w:gridCol w:w="2996"/>
+        <w:gridCol w:w="2568"/>
+      </w:tblGrid>
+      <w:tr>
+        <w:trPr>
+          <w:tblHeader w:val="on"/>
+        </w:trPr>
+        <w:tc>
+          <w:tcPr/>
+          <w:p>
+            <w:pPr>
+              <w:pStyle w:val="Compact"/>
+            </w:pPr>
+            <w:r>
+              <w:t xml:space="preserve">Reference</w:t>
+            </w:r>
+          </w:p>
+        </w:tc>
+        <w:tc>
+          <w:tcPr/>
+          <w:p>
+            <w:pPr>
+              <w:pStyle w:val="Compact"/>
+            </w:pPr>
+            <w:r>
+              <w:t xml:space="preserve">Contribution</w:t>
+            </w:r>
+          </w:p>
+        </w:tc>
+        <w:tc>
+          <w:tcPr/>
+          <w:p>
+            <w:pPr>
+              <w:pStyle w:val="Compact"/>
+            </w:pPr>
+            <w:r>
+              <w:t xml:space="preserve">Limitation</w:t>
+            </w:r>
+          </w:p>
+        </w:tc>
+      </w:tr>
+      <w:tr>
+        <w:tc>
+          <w:tcPr/>
+          <w:p>
+            <w:pPr>
+              <w:pStyle w:val="Compact"/>
+            </w:pPr>
+            <w:r>
+              <w:t xml:space="preserve">Bakkal et al. (2017)</w:t>
+            </w:r>
+          </w:p>
+        </w:tc>
+        <w:tc>
+          <w:tcPr/>
+          <w:p>
+            <w:pPr>
+              <w:pStyle w:val="Compact"/>
+            </w:pPr>
+            <w:r>
+              <w:t xml:space="preserve">Model and implement trajectories in Neo4j to support car-pool matching.</w:t>
+            </w:r>
+          </w:p>
+        </w:tc>
+        <w:tc>
+          <w:tcPr/>
+          <w:p>
+            <w:pPr>
+              <w:pStyle w:val="Compact"/>
+            </w:pPr>
+            <w:r>
+              <w:t xml:space="preserve">No performance metrics; modest dataset; trip semantics (cost, goal, purpose) not considered.</w:t>
+            </w:r>
+          </w:p>
+        </w:tc>
+      </w:tr>
+      <w:tr>
+        <w:tc>
+          <w:tcPr/>
+          <w:p>
+            <w:pPr>
+              <w:pStyle w:val="Compact"/>
+            </w:pPr>
+            <w:r>
+              <w:t xml:space="preserve">Khan et al. (2017)</w:t>
+            </w:r>
+          </w:p>
+        </w:tc>
+        <w:tc>
+          <w:tcPr/>
+          <w:p>
+            <w:pPr>
+              <w:pStyle w:val="Compact"/>
+            </w:pPr>
+            <w:r>
+              <w:t xml:space="preserve">Provide an empirical performance comparison between Neo4j and Oracle.</w:t>
+            </w:r>
+          </w:p>
+        </w:tc>
+        <w:tc>
+          <w:tcPr/>
+          <w:p>
+            <w:pPr>
+              <w:pStyle w:val="Compact"/>
+            </w:pPr>
+            <w:r>
+              <w:t xml:space="preserve">Spatial and spatio-temporal queries not considered.</w:t>
+            </w:r>
+          </w:p>
+        </w:tc>
+      </w:tr>
+      <w:tr>
+        <w:tc>
+          <w:tcPr/>
+          <w:p>
+            <w:pPr>
+              <w:pStyle w:val="Compact"/>
+            </w:pPr>
+            <w:r>
+              <w:t xml:space="preserve">Gómez, Kuijpers &amp; Vaisman (2019)</w:t>
+            </w:r>
+          </w:p>
+        </w:tc>
+        <w:tc>
+          <w:tcPr/>
+          <w:p>
+            <w:pPr>
+              <w:pStyle w:val="Compact"/>
+            </w:pPr>
+            <w:r>
+              <w:t xml:space="preserve">Implement a semantic trajectory model in Neo4j and compare it against PostgreSQL.</w:t>
+            </w:r>
+          </w:p>
+        </w:tc>
+        <w:tc>
+          <w:tcPr/>
+          <w:p>
+            <w:pPr>
+              <w:pStyle w:val="Compact"/>
+            </w:pPr>
+            <w:r>
+              <w:t xml:space="preserve">Limited relational baseline; moderate dataset; no big-data stress test.</w:t>
+            </w:r>
+          </w:p>
+        </w:tc>
+      </w:tr>
+      <w:tr>
+        <w:tc>
+          <w:tcPr/>
+          <w:p>
+            <w:pPr>
+              <w:pStyle w:val="Compact"/>
+            </w:pPr>
+            <w:r>
+              <w:t xml:space="preserve">Tamilmani &amp; Stefanakis (2019)</w:t>
+            </w:r>
+          </w:p>
+        </w:tc>
+        <w:tc>
+          <w:tcPr/>
+          <w:p>
+            <w:pPr>
+              <w:pStyle w:val="Compact"/>
+            </w:pPr>
+            <w:r>
+              <w:t xml:space="preserve">Propose a method for modelling and analyzing SESTs in Neo4j.</w:t>
+            </w:r>
+          </w:p>
+        </w:tc>
+        <w:tc>
+          <w:tcPr/>
+          <w:p>
+            <w:pPr>
+              <w:pStyle w:val="Compact"/>
+            </w:pPr>
+            <w:r>
+              <w:t xml:space="preserve">Limited query evaluation; no large-scale benchmark; algorithmic complexity not analyzed.</w:t>
+            </w:r>
+          </w:p>
+        </w:tc>
+      </w:tr>
+      <w:tr>
+        <w:tc>
+          <w:tcPr/>
+          <w:p>
+            <w:pPr>
+              <w:pStyle w:val="Compact"/>
+            </w:pPr>
+            <w:r>
+              <w:t xml:space="preserve">Karim et al. (2021)</w:t>
+            </w:r>
+          </w:p>
+        </w:tc>
+        <w:tc>
+          <w:tcPr/>
+          <w:p>
+            <w:pPr>
+              <w:pStyle w:val="Compact"/>
+            </w:pPr>
+            <w:r>
+              <w:t xml:space="preserve">Define a semantic trajectory model with events for pedestrian mobility analytics.</w:t>
+            </w:r>
+          </w:p>
+        </w:tc>
+        <w:tc>
+          <w:tcPr/>
+          <w:p>
+            <w:pPr>
+              <w:pStyle w:val="Compact"/>
+            </w:pPr>
+            <w:r>
+              <w:t xml:space="preserve">Neo4j schema and analytical queries not provided; no experimental evaluation.</w:t>
+            </w:r>
+          </w:p>
+        </w:tc>
+      </w:tr>
+      <w:tr>
+        <w:tc>
+          <w:tcPr/>
+          <w:p>
+            <w:pPr>
+              <w:pStyle w:val="Compact"/>
+            </w:pPr>
+            <w:r>
+              <w:t xml:space="preserve">Xue et al. (2022)</w:t>
+            </w:r>
+          </w:p>
+        </w:tc>
+        <w:tc>
+          <w:tcPr/>
+          <w:p>
+            <w:pPr>
+              <w:pStyle w:val="Compact"/>
+            </w:pPr>
+            <w:r>
+              <w:t xml:space="preserve">Present CoGAT, a hierarchical graph model for representing Argo float trajectories in Neo4j.</w:t>
+            </w:r>
+          </w:p>
+        </w:tc>
+        <w:tc>
+          <w:tcPr/>
+          <w:p>
+            <w:pPr>
+              <w:pStyle w:val="Compact"/>
+            </w:pPr>
+            <w:r>
+              <w:t xml:space="preserve">Domain-specific to Argo floats; limited generic attributes; coarse temporal granularity.</w:t>
+            </w:r>
+          </w:p>
+        </w:tc>
+      </w:tr>
+      <w:tr>
+        <w:tc>
+          <w:tcPr/>
+          <w:p>
+            <w:pPr>
+              <w:pStyle w:val="Compact"/>
+            </w:pPr>
+            <w:r>
+              <w:t xml:space="preserve">Elayam et al. (2022)</w:t>
+            </w:r>
+          </w:p>
+        </w:tc>
+        <w:tc>
+          <w:tcPr/>
+          <w:p>
+            <w:pPr>
+              <w:pStyle w:val="Compact"/>
+            </w:pPr>
+            <w:r>
+              <w:t xml:space="preserve">Propose a hierarchical graph-based model for analyzing mobility data at multiple spatial scales in Neo4j.</w:t>
+            </w:r>
+          </w:p>
+        </w:tc>
+        <w:tc>
+          <w:tcPr/>
+          <w:p>
+            <w:pPr>
+              <w:pStyle w:val="Compact"/>
+            </w:pPr>
+            <w:r>
+              <w:t xml:space="preserve">Validated only on maritime traffic data.</w:t>
+            </w:r>
+          </w:p>
+        </w:tc>
+      </w:tr>
+      <w:tr>
+        <w:tc>
+          <w:tcPr/>
+          <w:p>
+            <w:pPr>
+              <w:pStyle w:val="Compact"/>
+            </w:pPr>
+            <w:r>
+              <w:t xml:space="preserve">Estupiñán (2020)</w:t>
+            </w:r>
+          </w:p>
+        </w:tc>
+        <w:tc>
+          <w:tcPr/>
+          <w:p>
+            <w:pPr>
+              <w:pStyle w:val="Compact"/>
+            </w:pPr>
+            <w:r>
+              <w:t xml:space="preserve">Conduct clustering analysis on Ethereum with graph databases.</w:t>
+            </w:r>
+          </w:p>
+        </w:tc>
+        <w:tc>
+          <w:tcPr/>
+          <w:p>
+            <w:pPr>
+              <w:pStyle w:val="Compact"/>
+            </w:pPr>
+            <w:r>
+              <w:t xml:space="preserve">Focused on clustering and performance for two Ethereum use cases.</w:t>
+            </w:r>
+          </w:p>
+        </w:tc>
+      </w:tr>
+      <w:tr>
+        <w:tc>
+          <w:tcPr/>
+          <w:p>
+            <w:pPr>
+              <w:pStyle w:val="Compact"/>
+            </w:pPr>
+            <w:r>
+              <w:t xml:space="preserve">Lin et al. (2020)</w:t>
+            </w:r>
+          </w:p>
+        </w:tc>
+        <w:tc>
+          <w:tcPr/>
+          <w:p>
+            <w:pPr>
+              <w:pStyle w:val="Compact"/>
+            </w:pPr>
+            <w:r>
+              <w:t xml:space="preserve">Propose a temporal weighted multidigraph (TWMDG) model for Ethereum and temporal random-walk strategies for link prediction.</w:t>
+            </w:r>
+          </w:p>
+        </w:tc>
+        <w:tc>
+          <w:tcPr/>
+          <w:p>
+            <w:pPr>
+              <w:pStyle w:val="Compact"/>
+            </w:pPr>
+            <w:r>
+              <w:t xml:space="preserve">Focused on link prediction rather than transaction analysis; scalability not addressed.</w:t>
+            </w:r>
+          </w:p>
+        </w:tc>
+      </w:tr>
+    </w:tbl>
     <w:bookmarkEnd w:id="13"/>
     <w:bookmarkEnd w:id="14"/>
-    <w:bookmarkStart w:id="19" w:name="model-definition"/>
+    <w:bookmarkStart w:id="28" w:name="model-definition"/>
     <w:p>
       <w:pPr>
         <w:pStyle w:val="Heading2"/>
@@ -1059,10 +1481,77 @@
         <w:t xml:space="preserve"> </w:t>
       </w:r>
       <w:r>
-        <w:t xml:space="preserve">parent external transaction together with a sequential number.</w:t>
-      </w:r>
-    </w:p>
-    <w:bookmarkStart w:id="15" w:name="block-node"/>
+        <w:t xml:space="preserve">parent external transaction together with a sequential number. Thus, an external</w:t>
+      </w:r>
+      <w:r>
+        <w:t xml:space="preserve"> </w:t>
+      </w:r>
+      <w:r>
+        <w:t xml:space="preserve">transaction initiated by an EOA, whether addressed to another EOA or to a smart</w:t>
+      </w:r>
+      <w:r>
+        <w:t xml:space="preserve"> </w:t>
+      </w:r>
+      <w:r>
+        <w:t xml:space="preserve">contract, may trigger a cascade of internal transactions, as illustrated in Figure 1.</w:t>
+      </w:r>
+    </w:p>
+    <w:p>
+      <w:pPr>
+        <w:pStyle w:val="CaptionedFigure"/>
+      </w:pPr>
+      <w:r>
+        <w:drawing>
+          <wp:inline>
+            <wp:extent cx="5334000" cy="1034698"/>
+            <wp:effectExtent b="0" l="0" r="0" t="0"/>
+            <wp:docPr descr="Figure 1. External and internal transactions. An external transaction, initiated by an EOA and addressed to another account or to a smart contract, may trigger a cascade of internal transactions during contract execution." title="" id="16" name="Picture"/>
+            <a:graphic>
+              <a:graphicData uri="http://schemas.openxmlformats.org/drawingml/2006/picture">
+                <pic:pic>
+                  <pic:nvPicPr>
+                    <pic:cNvPr descr="figures/fig1_model_transactions.png" id="17" name="Picture"/>
+                    <pic:cNvPicPr>
+                      <a:picLocks noChangeArrowheads="1" noChangeAspect="1"/>
+                    </pic:cNvPicPr>
+                  </pic:nvPicPr>
+                  <pic:blipFill>
+                    <a:blip r:embed="rId15"/>
+                    <a:stretch>
+                      <a:fillRect/>
+                    </a:stretch>
+                  </pic:blipFill>
+                  <pic:spPr bwMode="auto">
+                    <a:xfrm>
+                      <a:off x="0" y="0"/>
+                      <a:ext cx="5334000" cy="1034698"/>
+                    </a:xfrm>
+                    <a:prstGeom prst="rect">
+                      <a:avLst/>
+                    </a:prstGeom>
+                    <a:noFill/>
+                    <a:ln w="9525">
+                      <a:noFill/>
+                      <a:headEnd/>
+                      <a:tailEnd/>
+                    </a:ln>
+                  </pic:spPr>
+                </pic:pic>
+              </a:graphicData>
+            </a:graphic>
+          </wp:inline>
+        </w:drawing>
+      </w:r>
+    </w:p>
+    <w:p>
+      <w:pPr>
+        <w:pStyle w:val="ImageCaption"/>
+      </w:pPr>
+      <w:r>
+        <w:t xml:space="preserve">Figure 1. External and internal transactions. An external transaction, initiated by an EOA and addressed to another account or to a smart contract, may trigger a cascade of internal transactions during contract execution.</w:t>
+      </w:r>
+    </w:p>
+    <w:bookmarkStart w:id="18" w:name="block-node"/>
     <w:p>
       <w:pPr>
         <w:pStyle w:val="Heading3"/>
@@ -1151,8 +1640,8 @@
         <w:t xml:space="preserve">.</w:t>
       </w:r>
     </w:p>
-    <w:bookmarkEnd w:id="15"/>
-    <w:bookmarkStart w:id="16" w:name="transaction-node"/>
+    <w:bookmarkEnd w:id="18"/>
+    <w:bookmarkStart w:id="19" w:name="transaction-node"/>
     <w:p>
       <w:pPr>
         <w:pStyle w:val="Heading3"/>
@@ -1268,8 +1757,8 @@
         <w:t xml:space="preserve">.</w:t>
       </w:r>
     </w:p>
-    <w:bookmarkEnd w:id="16"/>
-    <w:bookmarkStart w:id="17" w:name="account-node"/>
+    <w:bookmarkEnd w:id="19"/>
+    <w:bookmarkStart w:id="20" w:name="account-node"/>
     <w:p>
       <w:pPr>
         <w:pStyle w:val="Heading3"/>
@@ -1393,8 +1882,8 @@
         <w:t xml:space="preserve">analysis pursued here. Block nodes likewise retain only number and timestamp.</w:t>
       </w:r>
     </w:p>
-    <w:bookmarkEnd w:id="17"/>
-    <w:bookmarkStart w:id="18" w:name="edges"/>
+    <w:bookmarkEnd w:id="20"/>
+    <w:bookmarkStart w:id="27" w:name="edges"/>
     <w:p>
       <w:pPr>
         <w:pStyle w:val="Heading3"/>
@@ -1593,9 +2082,263 @@
         <w:t xml:space="preserve">datatypes are illustrated in Figures 2 and 3.</w:t>
       </w:r>
     </w:p>
-    <w:bookmarkEnd w:id="18"/>
-    <w:bookmarkEnd w:id="19"/>
-    <w:bookmarkStart w:id="41" w:name="experiments"/>
+    <w:p>
+      <w:pPr>
+        <w:pStyle w:val="CaptionedFigure"/>
+      </w:pPr>
+      <w:r>
+        <w:drawing>
+          <wp:inline>
+            <wp:extent cx="5334000" cy="4327723"/>
+            <wp:effectExtent b="0" l="0" r="0" t="0"/>
+            <wp:docPr descr="Figure 2. Structure of blocks and external transactions. Blocks form a trajectory through previous block edges; an external transaction is recorded in its block and linked by sent by / received by to its sender and receiver accounts. Account nodes carry only address and isContract." title="" id="22" name="Picture"/>
+            <a:graphic>
+              <a:graphicData uri="http://schemas.openxmlformats.org/drawingml/2006/picture">
+                <pic:pic>
+                  <pic:nvPicPr>
+                    <pic:cNvPr descr="figures/fig2_model_block_external.png" id="23" name="Picture"/>
+                    <pic:cNvPicPr>
+                      <a:picLocks noChangeArrowheads="1" noChangeAspect="1"/>
+                    </pic:cNvPicPr>
+                  </pic:nvPicPr>
+                  <pic:blipFill>
+                    <a:blip r:embed="rId21"/>
+                    <a:stretch>
+                      <a:fillRect/>
+                    </a:stretch>
+                  </pic:blipFill>
+                  <pic:spPr bwMode="auto">
+                    <a:xfrm>
+                      <a:off x="0" y="0"/>
+                      <a:ext cx="5334000" cy="4327723"/>
+                    </a:xfrm>
+                    <a:prstGeom prst="rect">
+                      <a:avLst/>
+                    </a:prstGeom>
+                    <a:noFill/>
+                    <a:ln w="9525">
+                      <a:noFill/>
+                      <a:headEnd/>
+                      <a:tailEnd/>
+                    </a:ln>
+                  </pic:spPr>
+                </pic:pic>
+              </a:graphicData>
+            </a:graphic>
+          </wp:inline>
+        </w:drawing>
+      </w:r>
+    </w:p>
+    <w:p>
+      <w:pPr>
+        <w:pStyle w:val="ImageCaption"/>
+      </w:pPr>
+      <w:r>
+        <w:t xml:space="preserve">Figure 2. Structure of blocks and external transactions. Blocks form a trajectory through</w:t>
+      </w:r>
+      <w:r>
+        <w:t xml:space="preserve"> </w:t>
+      </w:r>
+      <w:r>
+        <w:rPr>
+          <w:rStyle w:val="VerbatimChar"/>
+        </w:rPr>
+        <w:t xml:space="preserve">previous block</w:t>
+      </w:r>
+      <w:r>
+        <w:t xml:space="preserve"> </w:t>
+      </w:r>
+      <w:r>
+        <w:t xml:space="preserve">edges; an external transaction is</w:t>
+      </w:r>
+      <w:r>
+        <w:t xml:space="preserve"> </w:t>
+      </w:r>
+      <w:r>
+        <w:rPr>
+          <w:rStyle w:val="VerbatimChar"/>
+        </w:rPr>
+        <w:t xml:space="preserve">recorded in</w:t>
+      </w:r>
+      <w:r>
+        <w:t xml:space="preserve"> </w:t>
+      </w:r>
+      <w:r>
+        <w:t xml:space="preserve">its block and linked by</w:t>
+      </w:r>
+      <w:r>
+        <w:t xml:space="preserve"> </w:t>
+      </w:r>
+      <w:r>
+        <w:rPr>
+          <w:rStyle w:val="VerbatimChar"/>
+        </w:rPr>
+        <w:t xml:space="preserve">sent by</w:t>
+      </w:r>
+      <w:r>
+        <w:t xml:space="preserve"> </w:t>
+      </w:r>
+      <w:r>
+        <w:t xml:space="preserve">/</w:t>
+      </w:r>
+      <w:r>
+        <w:t xml:space="preserve"> </w:t>
+      </w:r>
+      <w:r>
+        <w:rPr>
+          <w:rStyle w:val="VerbatimChar"/>
+        </w:rPr>
+        <w:t xml:space="preserve">received by</w:t>
+      </w:r>
+      <w:r>
+        <w:t xml:space="preserve"> </w:t>
+      </w:r>
+      <w:r>
+        <w:t xml:space="preserve">to its sender and receiver accounts. Account nodes carry only</w:t>
+      </w:r>
+      <w:r>
+        <w:t xml:space="preserve"> </w:t>
+      </w:r>
+      <w:r>
+        <w:rPr>
+          <w:rStyle w:val="VerbatimChar"/>
+        </w:rPr>
+        <w:t xml:space="preserve">address</w:t>
+      </w:r>
+      <w:r>
+        <w:t xml:space="preserve"> </w:t>
+      </w:r>
+      <w:r>
+        <w:t xml:space="preserve">and</w:t>
+      </w:r>
+      <w:r>
+        <w:t xml:space="preserve"> </w:t>
+      </w:r>
+      <w:r>
+        <w:rPr>
+          <w:rStyle w:val="VerbatimChar"/>
+        </w:rPr>
+        <w:t xml:space="preserve">isContract</w:t>
+      </w:r>
+      <w:r>
+        <w:t xml:space="preserve">.</w:t>
+      </w:r>
+    </w:p>
+    <w:p>
+      <w:pPr>
+        <w:pStyle w:val="CaptionedFigure"/>
+      </w:pPr>
+      <w:r>
+        <w:drawing>
+          <wp:inline>
+            <wp:extent cx="5334000" cy="4824145"/>
+            <wp:effectExtent b="0" l="0" r="0" t="0"/>
+            <wp:docPr descr="Figure 3. Relationship between external and internal transactions. An external transaction triggers internal transactions (keyed by parentTransactionHash and sequenceId), each linked by internal sent by / internal received by to its own sender and receiver accounts." title="" id="25" name="Picture"/>
+            <a:graphic>
+              <a:graphicData uri="http://schemas.openxmlformats.org/drawingml/2006/picture">
+                <pic:pic>
+                  <pic:nvPicPr>
+                    <pic:cNvPr descr="figures/fig3_model_internal.png" id="26" name="Picture"/>
+                    <pic:cNvPicPr>
+                      <a:picLocks noChangeArrowheads="1" noChangeAspect="1"/>
+                    </pic:cNvPicPr>
+                  </pic:nvPicPr>
+                  <pic:blipFill>
+                    <a:blip r:embed="rId24"/>
+                    <a:stretch>
+                      <a:fillRect/>
+                    </a:stretch>
+                  </pic:blipFill>
+                  <pic:spPr bwMode="auto">
+                    <a:xfrm>
+                      <a:off x="0" y="0"/>
+                      <a:ext cx="5334000" cy="4824145"/>
+                    </a:xfrm>
+                    <a:prstGeom prst="rect">
+                      <a:avLst/>
+                    </a:prstGeom>
+                    <a:noFill/>
+                    <a:ln w="9525">
+                      <a:noFill/>
+                      <a:headEnd/>
+                      <a:tailEnd/>
+                    </a:ln>
+                  </pic:spPr>
+                </pic:pic>
+              </a:graphicData>
+            </a:graphic>
+          </wp:inline>
+        </w:drawing>
+      </w:r>
+    </w:p>
+    <w:p>
+      <w:pPr>
+        <w:pStyle w:val="ImageCaption"/>
+      </w:pPr>
+      <w:r>
+        <w:t xml:space="preserve">Figure 3. Relationship between external and internal transactions. An external transaction triggers internal transactions (keyed by</w:t>
+      </w:r>
+      <w:r>
+        <w:t xml:space="preserve"> </w:t>
+      </w:r>
+      <w:r>
+        <w:rPr>
+          <w:rStyle w:val="VerbatimChar"/>
+        </w:rPr>
+        <w:t xml:space="preserve">parentTransactionHash</w:t>
+      </w:r>
+      <w:r>
+        <w:t xml:space="preserve"> </w:t>
+      </w:r>
+      <w:r>
+        <w:t xml:space="preserve">and</w:t>
+      </w:r>
+      <w:r>
+        <w:t xml:space="preserve"> </w:t>
+      </w:r>
+      <w:r>
+        <w:rPr>
+          <w:rStyle w:val="VerbatimChar"/>
+        </w:rPr>
+        <w:t xml:space="preserve">sequenceId</w:t>
+      </w:r>
+      <w:r>
+        <w:t xml:space="preserve">), each linked by</w:t>
+      </w:r>
+      <w:r>
+        <w:t xml:space="preserve"> </w:t>
+      </w:r>
+      <w:r>
+        <w:rPr>
+          <w:rStyle w:val="VerbatimChar"/>
+        </w:rPr>
+        <w:t xml:space="preserve">internal sent by</w:t>
+      </w:r>
+      <w:r>
+        <w:t xml:space="preserve"> </w:t>
+      </w:r>
+      <w:r>
+        <w:t xml:space="preserve">/</w:t>
+      </w:r>
+      <w:r>
+        <w:t xml:space="preserve"> </w:t>
+      </w:r>
+      <w:r>
+        <w:rPr>
+          <w:rStyle w:val="VerbatimChar"/>
+        </w:rPr>
+        <w:t xml:space="preserve">internal received by</w:t>
+      </w:r>
+      <w:r>
+        <w:t xml:space="preserve"> </w:t>
+      </w:r>
+      <w:r>
+        <w:t xml:space="preserve">to its own sender and receiver accounts.</w:t>
+      </w:r>
+    </w:p>
+    <w:bookmarkEnd w:id="27"/>
+    <w:bookmarkEnd w:id="28"/>
+    <w:bookmarkStart w:id="50" w:name="experiments"/>
     <w:p>
       <w:pPr>
         <w:pStyle w:val="Heading2"/>
@@ -1624,7 +2367,7 @@
         <w:t xml:space="preserve">2026.01.3.</w:t>
       </w:r>
     </w:p>
-    <w:bookmarkStart w:id="20" w:name="data-acquisition"/>
+    <w:bookmarkStart w:id="29" w:name="data-acquisition"/>
     <w:p>
       <w:pPr>
         <w:pStyle w:val="Heading3"/>
@@ -1904,8 +2647,8 @@
         <w:t xml:space="preserve">blocks.</w:t>
       </w:r>
     </w:p>
-    <w:bookmarkEnd w:id="20"/>
-    <w:bookmarkStart w:id="21" w:name="experimental-design"/>
+    <w:bookmarkEnd w:id="29"/>
+    <w:bookmarkStart w:id="30" w:name="experimental-design"/>
     <w:p>
       <w:pPr>
         <w:pStyle w:val="Heading3"/>
@@ -2386,8 +3129,8 @@
         <w:t xml:space="preserve">ORDER BY total_received DESC LIMIT 10</w:t>
       </w:r>
     </w:p>
-    <w:bookmarkEnd w:id="21"/>
-    <w:bookmarkStart w:id="28" w:name="X414a02d4983aa37a2008d50d34b712461638660"/>
+    <w:bookmarkEnd w:id="30"/>
+    <w:bookmarkStart w:id="37" w:name="X414a02d4983aa37a2008d50d34b712461638660"/>
     <w:p>
       <w:pPr>
         <w:pStyle w:val="Heading3"/>
@@ -2461,18 +3204,18 @@
           <wp:inline>
             <wp:extent cx="5334000" cy="2667000"/>
             <wp:effectExtent b="0" l="0" r="0" t="0"/>
-            <wp:docPr descr="Figure 4. Top-ten accounts by total ETH received, across cumulative block ranges (2–10,000 blocks) in the post-Dencun 2024 era. The Wrapped Ether contract (0xc02a…56cc2) dominates the larger windows." title="" id="23" name="Picture"/>
+            <wp:docPr descr="Figure 4. Top-ten accounts by total ETH received, across cumulative block ranges (2–10,000 blocks) in the post-Dencun 2024 era. The Wrapped Ether contract (0xc02a…56cc2) dominates the larger windows." title="" id="32" name="Picture"/>
             <a:graphic>
               <a:graphicData uri="http://schemas.openxmlformats.org/drawingml/2006/picture">
                 <pic:pic>
                   <pic:nvPicPr>
-                    <pic:cNvPr descr="figures/fig4_within2024_received.png" id="24" name="Picture"/>
+                    <pic:cNvPr descr="figures/fig4_within2024_received.png" id="33" name="Picture"/>
                     <pic:cNvPicPr>
                       <a:picLocks noChangeArrowheads="1" noChangeAspect="1"/>
                     </pic:cNvPicPr>
                   </pic:nvPicPr>
                   <pic:blipFill>
-                    <a:blip r:embed="rId22"/>
+                    <a:blip r:embed="rId31"/>
                     <a:stretch>
                       <a:fillRect/>
                     </a:stretch>
@@ -2606,18 +3349,18 @@
           <wp:inline>
             <wp:extent cx="5334000" cy="2667000"/>
             <wp:effectExtent b="0" l="0" r="0" t="0"/>
-            <wp:docPr descr="Figure 5. Top-ten accounts by transaction-participation percentage, across cumulative block ranges (2–10,000 blocks) in the 2024 era. The curves for every window size overlap: Wrapped Ether (rank 1) holds between 5.8% and 7.0% of participations across all scales (highest at the smallest window), and the whole top-ten profile is stable." title="" id="26" name="Picture"/>
+            <wp:docPr descr="Figure 5. Top-ten accounts by transaction-participation percentage, across cumulative block ranges (2–10,000 blocks) in the 2024 era. The curves for every window size overlap: Wrapped Ether (rank 1) holds between 5.8% and 7.0% of participations across all scales (highest at the smallest window), and the whole top-ten profile is stable." title="" id="35" name="Picture"/>
             <a:graphic>
               <a:graphicData uri="http://schemas.openxmlformats.org/drawingml/2006/picture">
                 <pic:pic>
                   <pic:nvPicPr>
-                    <pic:cNvPr descr="figures/fig5_within2024_participation.png" id="27" name="Picture"/>
+                    <pic:cNvPr descr="figures/fig5_within2024_participation.png" id="36" name="Picture"/>
                     <pic:cNvPicPr>
                       <a:picLocks noChangeArrowheads="1" noChangeAspect="1"/>
                     </pic:cNvPicPr>
                   </pic:nvPicPr>
                   <pic:blipFill>
-                    <a:blip r:embed="rId25"/>
+                    <a:blip r:embed="rId34"/>
                     <a:stretch>
                       <a:fillRect/>
                     </a:stretch>
@@ -2718,8 +3461,8 @@
         <w:t xml:space="preserve">i.e. most internal transfers are small and a few large ones move the mean.</w:t>
       </w:r>
     </w:p>
-    <w:bookmarkEnd w:id="28"/>
-    <w:bookmarkStart w:id="38" w:name="cross-era-comparison"/>
+    <w:bookmarkEnd w:id="37"/>
+    <w:bookmarkStart w:id="47" w:name="cross-era-comparison"/>
     <w:p>
       <w:pPr>
         <w:pStyle w:val="Heading3"/>
@@ -3313,18 +4056,18 @@
           <wp:inline>
             <wp:extent cx="5334000" cy="2286000"/>
             <wp:effectExtent b="0" l="0" r="0" t="0"/>
-            <wp:docPr descr="Figure 6. Cross-era transaction volume at fixed 10,000-block windows. Left: external transactions per block rise from ~8 (2016) to 130–188 in the modern eras (densification). Right: the internal-to-external transaction ratio jumps from 0.20 (2016, 2020) to ~0.57 after the Merge (rising smart-contract complexity)." title="" id="30" name="Picture"/>
+            <wp:docPr descr="Figure 6. Cross-era transaction volume at fixed 10,000-block windows. Left: external transactions per block rise from ~8 (2016) to 130–188 in the modern eras (densification). Right: the internal-to-external transaction ratio jumps from 0.20 (2016, 2020) to ~0.57 after the Merge (rising smart-contract complexity)." title="" id="39" name="Picture"/>
             <a:graphic>
               <a:graphicData uri="http://schemas.openxmlformats.org/drawingml/2006/picture">
                 <pic:pic>
                   <pic:nvPicPr>
-                    <pic:cNvPr descr="figures/fig6_cross_era_volume.png" id="31" name="Picture"/>
+                    <pic:cNvPr descr="figures/fig6_cross_era_volume.png" id="40" name="Picture"/>
                     <pic:cNvPicPr>
                       <a:picLocks noChangeArrowheads="1" noChangeAspect="1"/>
                     </pic:cNvPicPr>
                   </pic:nvPicPr>
                   <pic:blipFill>
-                    <a:blip r:embed="rId29"/>
+                    <a:blip r:embed="rId38"/>
                     <a:stretch>
                       <a:fillRect/>
                     </a:stretch>
@@ -3597,18 +4340,18 @@
           <wp:inline>
             <wp:extent cx="5334000" cy="2667000"/>
             <wp:effectExtent b="0" l="0" r="0" t="0"/>
-            <wp:docPr descr="Figure 7. Top-ten accounts by transaction-participation percentage, compared across the four eras (10,000-block windows). The concentration profile differs by era — the post-Merge 2023 window is notably flatter (more distributed) than 2016, 2020, and 2024." title="" id="33" name="Picture"/>
+            <wp:docPr descr="Figure 7. Top-ten accounts by transaction-participation percentage, compared across the four eras (10,000-block windows). The concentration profile differs by era — the post-Merge 2023 window is notably flatter (more distributed) than 2016, 2020, and 2024." title="" id="42" name="Picture"/>
             <a:graphic>
               <a:graphicData uri="http://schemas.openxmlformats.org/drawingml/2006/picture">
                 <pic:pic>
                   <pic:nvPicPr>
-                    <pic:cNvPr descr="figures/fig7_crossera_participation.png" id="34" name="Picture"/>
+                    <pic:cNvPr descr="figures/fig7_crossera_participation.png" id="43" name="Picture"/>
                     <pic:cNvPicPr>
                       <a:picLocks noChangeArrowheads="1" noChangeAspect="1"/>
                     </pic:cNvPicPr>
                   </pic:nvPicPr>
                   <pic:blipFill>
-                    <a:blip r:embed="rId32"/>
+                    <a:blip r:embed="rId41"/>
                     <a:stretch>
                       <a:fillRect/>
                     </a:stretch>
@@ -3652,18 +4395,18 @@
           <wp:inline>
             <wp:extent cx="5334000" cy="2667000"/>
             <wp:effectExtent b="0" l="0" r="0" t="0"/>
-            <wp:docPr descr="Figure 8. Top-ten accounts by total ETH received, compared across the four eras (10,000-block windows). The dominant recipient shifts across eras: an early contract in 2016, the Uniswap V2 Router in 2020, and Wrapped Ether in 2024." title="" id="36" name="Picture"/>
+            <wp:docPr descr="Figure 8. Top-ten accounts by total ETH received, compared across the four eras (10,000-block windows). The dominant recipient shifts across eras: an early contract in 2016, the Uniswap V2 Router in 2020, and Wrapped Ether in 2024." title="" id="45" name="Picture"/>
             <a:graphic>
               <a:graphicData uri="http://schemas.openxmlformats.org/drawingml/2006/picture">
                 <pic:pic>
                   <pic:nvPicPr>
-                    <pic:cNvPr descr="figures/fig8_crossera_received.png" id="37" name="Picture"/>
+                    <pic:cNvPr descr="figures/fig8_crossera_received.png" id="46" name="Picture"/>
                     <pic:cNvPicPr>
                       <a:picLocks noChangeArrowheads="1" noChangeAspect="1"/>
                     </pic:cNvPicPr>
                   </pic:nvPicPr>
                   <pic:blipFill>
-                    <a:blip r:embed="rId35"/>
+                    <a:blip r:embed="rId44"/>
                     <a:stretch>
                       <a:fillRect/>
                     </a:stretch>
@@ -3730,8 +4473,8 @@
         <w:t xml:space="preserve">. The main result tables are collected in Appendix A.</w:t>
       </w:r>
     </w:p>
-    <w:bookmarkEnd w:id="38"/>
-    <w:bookmarkStart w:id="39" w:name="Xad531036f6f55fe8e17c4d23717ff4bbe8d9f9d"/>
+    <w:bookmarkEnd w:id="47"/>
+    <w:bookmarkStart w:id="48" w:name="Xad531036f6f55fe8e17c4d23717ff4bbe8d9f9d"/>
     <w:p>
       <w:pPr>
         <w:pStyle w:val="Heading3"/>
@@ -3796,8 +4539,8 @@
         <w:t xml:space="preserve">.</w:t>
       </w:r>
     </w:p>
-    <w:bookmarkEnd w:id="39"/>
-    <w:bookmarkStart w:id="40" w:name="query-scalability-note"/>
+    <w:bookmarkEnd w:id="48"/>
+    <w:bookmarkStart w:id="49" w:name="query-scalability-note"/>
     <w:p>
       <w:pPr>
         <w:pStyle w:val="Heading3"/>
@@ -3865,9 +4608,9 @@
         <w:t xml:space="preserve">reformulation to reach 10,000 blocks; the remaining queries scale directly.</w:t>
       </w:r>
     </w:p>
-    <w:bookmarkEnd w:id="40"/>
-    <w:bookmarkEnd w:id="41"/>
-    <w:bookmarkStart w:id="46" w:name="X6e20e48d8080825a996d4b347f2557e462ff813"/>
+    <w:bookmarkEnd w:id="49"/>
+    <w:bookmarkEnd w:id="50"/>
+    <w:bookmarkStart w:id="55" w:name="X6e20e48d8080825a996d4b347f2557e462ff813"/>
     <w:p>
       <w:pPr>
         <w:pStyle w:val="Heading2"/>
@@ -3896,7 +4639,7 @@
         <w:t xml:space="preserve">small-scale analysis could.</w:t>
       </w:r>
     </w:p>
-    <w:bookmarkStart w:id="42" w:name="analytical-capabilities-demonstrated"/>
+    <w:bookmarkStart w:id="51" w:name="analytical-capabilities-demonstrated"/>
     <w:p>
       <w:pPr>
         <w:pStyle w:val="Heading3"/>
@@ -4256,8 +4999,8 @@
         </w:tc>
       </w:tr>
     </w:tbl>
-    <w:bookmarkEnd w:id="42"/>
-    <w:bookmarkStart w:id="43" w:name="strengths-where-the-model-is-useful"/>
+    <w:bookmarkEnd w:id="51"/>
+    <w:bookmarkStart w:id="52" w:name="strengths-where-the-model-is-useful"/>
     <w:p>
       <w:pPr>
         <w:pStyle w:val="Heading3"/>
@@ -4470,8 +5213,8 @@
         <w:t xml:space="preserve">concentration itself stays flat across scales (§4.3).</w:t>
       </w:r>
     </w:p>
-    <w:bookmarkEnd w:id="43"/>
-    <w:bookmarkStart w:id="44" w:name="limitations-where-it-struggles"/>
+    <w:bookmarkEnd w:id="52"/>
+    <w:bookmarkStart w:id="53" w:name="limitations-where-it-struggles"/>
     <w:p>
       <w:pPr>
         <w:pStyle w:val="Heading3"/>
@@ -4865,8 +5608,8 @@
         <w:t xml:space="preserve">value/participation rankings.</w:t>
       </w:r>
     </w:p>
-    <w:bookmarkEnd w:id="44"/>
-    <w:bookmarkStart w:id="45" w:name="were-the-two-new-axes-worth-it"/>
+    <w:bookmarkEnd w:id="53"/>
+    <w:bookmarkStart w:id="54" w:name="were-the-two-new-axes-worth-it"/>
     <w:p>
       <w:pPr>
         <w:pStyle w:val="Heading3"/>
@@ -5051,9 +5794,9 @@
         <w:t xml:space="preserve">model can say.</w:t>
       </w:r>
     </w:p>
-    <w:bookmarkEnd w:id="45"/>
-    <w:bookmarkEnd w:id="46"/>
-    <w:bookmarkStart w:id="47" w:name="conclusions-and-future-work"/>
+    <w:bookmarkEnd w:id="54"/>
+    <w:bookmarkEnd w:id="55"/>
+    <w:bookmarkStart w:id="56" w:name="conclusions-and-future-work"/>
     <w:p>
       <w:pPr>
         <w:pStyle w:val="Heading2"/>
@@ -5224,8 +5967,8 @@
         <w:t xml:space="preserve">sensitive to scale.</w:t>
       </w:r>
     </w:p>
-    <w:bookmarkEnd w:id="47"/>
-    <w:bookmarkStart w:id="49" w:name="code-and-data-availability"/>
+    <w:bookmarkEnd w:id="56"/>
+    <w:bookmarkStart w:id="58" w:name="code-and-data-availability"/>
     <w:p>
       <w:pPr>
         <w:pStyle w:val="Heading2"/>
@@ -5256,7 +5999,7 @@
       <w:r>
         <w:t xml:space="preserve"> </w:t>
       </w:r>
-      <w:hyperlink r:id="rId48">
+      <w:hyperlink r:id="rId57">
         <w:r>
           <w:rPr>
             <w:rStyle w:val="Hyperlink"/>
@@ -5295,8 +6038,8 @@
         <w:t xml:space="preserve">block windows, the cumulative block-count ladder, and the eras used.</w:t>
       </w:r>
     </w:p>
-    <w:bookmarkEnd w:id="49"/>
-    <w:bookmarkStart w:id="50" w:name="references"/>
+    <w:bookmarkEnd w:id="58"/>
+    <w:bookmarkStart w:id="70" w:name="references"/>
     <w:p>
       <w:pPr>
         <w:pStyle w:val="Heading2"/>
@@ -5309,12 +6052,24 @@
       <w:pPr>
         <w:pStyle w:val="FirstParagraph"/>
       </w:pPr>
+      <w:r>
+        <w:t xml:space="preserve">Bakkal, F., Eken, S., Savaş, N. S., &amp; Sayar, A. (2017). Modeling and querying</w:t>
+      </w:r>
+      <w:r>
+        <w:t xml:space="preserve"> </w:t>
+      </w:r>
+      <w:r>
+        <w:t xml:space="preserve">trajectories using Neo4j Spatial and TimeTree for carpool matching.</w:t>
+      </w:r>
+      <w:r>
+        <w:t xml:space="preserve"> </w:t>
+      </w:r>
       <w:r>
         <w:rPr>
           <w:i/>
           <w:iCs/>
         </w:rPr>
-        <w:t xml:space="preserve">(Bakkal et al. 2017; Elayam et al. 2022; Gómez,</w:t>
+        <w:t xml:space="preserve">2017</w:t>
       </w:r>
       <w:r>
         <w:rPr>
@@ -5328,7 +6083,7 @@
           <w:i/>
           <w:iCs/>
         </w:rPr>
-        <w:t xml:space="preserve">Kuijpers &amp; Vaisman 2019; Karim et al. 2021; Khan et al. 2017; Lin et al. 2020;</w:t>
+        <w:t xml:space="preserve">International Conference on Innovations in Intelligent Systems and Applications</w:t>
       </w:r>
       <w:r>
         <w:rPr>
@@ -5342,13 +6097,78 @@
           <w:i/>
           <w:iCs/>
         </w:rPr>
-        <w:t xml:space="preserve">Tamilmani &amp; Stefanakis 2019; Xue et al. 2022; Estupiñán 2020; Said et al. 2021;</w:t>
+        <w:t xml:space="preserve">(INISTA)</w:t>
+      </w:r>
+      <w:r>
+        <w:t xml:space="preserve"> </w:t>
+      </w:r>
+      <w:r>
+        <w:t xml:space="preserve">(pp. 219–222).</w:t>
+      </w:r>
+      <w:r>
+        <w:t xml:space="preserve"> </w:t>
+      </w:r>
+      <w:hyperlink r:id="rId59">
+        <w:r>
+          <w:rPr>
+            <w:rStyle w:val="Hyperlink"/>
+          </w:rPr>
+          <w:t xml:space="preserve">https://doi.org/10.1109/INISTA.2017.8001160</w:t>
+        </w:r>
+      </w:hyperlink>
+    </w:p>
+    <w:p>
+      <w:pPr>
+        <w:pStyle w:val="BodyText"/>
+      </w:pPr>
+      <w:r>
+        <w:t xml:space="preserve">Elayam, M. M., Ray, C., &amp; Claramunt, C. (2022). A hierarchical graph-based model for</w:t>
+      </w:r>
+      <w:r>
+        <w:t xml:space="preserve"> </w:t>
+      </w:r>
+      <w:r>
+        <w:t xml:space="preserve">mobility data representation and analysis.</w:t>
+      </w:r>
+      <w:r>
+        <w:t xml:space="preserve"> </w:t>
       </w:r>
       <w:r>
         <w:rPr>
           <w:i/>
           <w:iCs/>
         </w:rPr>
+        <w:t xml:space="preserve">Data &amp; Knowledge Engineering, 142</w:t>
+      </w:r>
+      <w:r>
+        <w:t xml:space="preserve">,</w:t>
+      </w:r>
+      <w:r>
+        <w:t xml:space="preserve"> </w:t>
+      </w:r>
+      <w:r>
+        <w:t xml:space="preserve">102054.</w:t>
+      </w:r>
+      <w:r>
+        <w:t xml:space="preserve"> </w:t>
+      </w:r>
+      <w:hyperlink r:id="rId60">
+        <w:r>
+          <w:rPr>
+            <w:rStyle w:val="Hyperlink"/>
+          </w:rPr>
+          <w:t xml:space="preserve">https://doi.org/10.1016/j.datak.2022.102054</w:t>
+        </w:r>
+      </w:hyperlink>
+    </w:p>
+    <w:p>
+      <w:pPr>
+        <w:pStyle w:val="BodyText"/>
+      </w:pPr>
+      <w:r>
+        <w:t xml:space="preserve">Estupiñán, A. (2020).</w:t>
+      </w:r>
+      <w:r>
         <w:t xml:space="preserve"> </w:t>
       </w:r>
       <w:r>
@@ -5356,13 +6176,84 @@
           <w:i/>
           <w:iCs/>
         </w:rPr>
-        <w:t xml:space="preserve">Kiffer et al. 2018; Victor &amp; Weintraud 2021; Victor 2019; Tschorsch &amp; Scheuermann</w:t>
+        <w:t xml:space="preserve">Analysis of modern blockchain networks using graph databases</w:t>
+      </w:r>
+      <w:r>
+        <w:t xml:space="preserve"> </w:t>
+      </w:r>
+      <w:r>
+        <w:t xml:space="preserve">[Master’s thesis, Technische Universität Berlin, Service-centric Networking].</w:t>
+      </w:r>
+      <w:r>
+        <w:t xml:space="preserve"> </w:t>
+      </w:r>
+      <w:hyperlink r:id="rId61">
+        <w:r>
+          <w:rPr>
+            <w:rStyle w:val="Hyperlink"/>
+          </w:rPr>
+          <w:t xml:space="preserve">https://doi.org/10.13140/RG.2.2.20215.14245</w:t>
+        </w:r>
+      </w:hyperlink>
+    </w:p>
+    <w:p>
+      <w:pPr>
+        <w:pStyle w:val="BodyText"/>
+      </w:pPr>
+      <w:r>
+        <w:t xml:space="preserve">Gómez, L. I., Kuijpers, B., &amp; Vaisman, A. (2019). Analytical queries on semantic</w:t>
+      </w:r>
+      <w:r>
+        <w:t xml:space="preserve"> </w:t>
+      </w:r>
+      <w:r>
+        <w:t xml:space="preserve">trajectories using graph databases.</w:t>
+      </w:r>
+      <w:r>
+        <w:t xml:space="preserve"> </w:t>
       </w:r>
       <w:r>
         <w:rPr>
           <w:i/>
           <w:iCs/>
         </w:rPr>
+        <w:t xml:space="preserve">Transactions in GIS, 23</w:t>
+      </w:r>
+      <w:r>
+        <w:t xml:space="preserve">(5), 948–973.</w:t>
+      </w:r>
+      <w:r>
+        <w:t xml:space="preserve"> </w:t>
+      </w:r>
+      <w:hyperlink r:id="rId62">
+        <w:r>
+          <w:rPr>
+            <w:rStyle w:val="Hyperlink"/>
+          </w:rPr>
+          <w:t xml:space="preserve">https://doi.org/10.1111/tgis.12556</w:t>
+        </w:r>
+      </w:hyperlink>
+    </w:p>
+    <w:p>
+      <w:pPr>
+        <w:pStyle w:val="BodyText"/>
+      </w:pPr>
+      <w:r>
+        <w:t xml:space="preserve">Karim, L., Boulmakoul, A., Zeitouni, K., &amp; Lbath, A. (2021). From raw pedestrian</w:t>
+      </w:r>
+      <w:r>
+        <w:t xml:space="preserve"> </w:t>
+      </w:r>
+      <w:r>
+        <w:t xml:space="preserve">trajectories to a semantic graph-structured model: Towards an end-to-end</w:t>
+      </w:r>
+      <w:r>
+        <w:t xml:space="preserve"> </w:t>
+      </w:r>
+      <w:r>
+        <w:t xml:space="preserve">spatiotemporal analytics framework.</w:t>
+      </w:r>
+      <w:r>
         <w:t xml:space="preserve"> </w:t>
       </w:r>
       <w:r>
@@ -5370,14 +6261,405 @@
           <w:i/>
           <w:iCs/>
         </w:rPr>
-        <w:t xml:space="preserve">2016.)</w:t>
-      </w:r>
+        <w:t xml:space="preserve">Procedia Computer Science, 184</w:t>
+      </w:r>
+      <w:r>
+        <w:t xml:space="preserve">, 60–67.</w:t>
+      </w:r>
+      <w:r>
+        <w:t xml:space="preserve"> </w:t>
+      </w:r>
+      <w:hyperlink r:id="rId63">
+        <w:r>
+          <w:rPr>
+            <w:rStyle w:val="Hyperlink"/>
+          </w:rPr>
+          <w:t xml:space="preserve">https://doi.org/10.1016/j.procs.2021.03.018</w:t>
+        </w:r>
+      </w:hyperlink>
     </w:p>
     <w:p>
       <w:pPr>
         <w:pStyle w:val="BodyText"/>
       </w:pPr>
       <w:r>
+        <w:t xml:space="preserve">Khan, W., Ahmed, E., &amp; Shahzad, W. (2017). Predictive performance comparison analysis</w:t>
+      </w:r>
+      <w:r>
+        <w:t xml:space="preserve"> </w:t>
+      </w:r>
+      <w:r>
+        <w:t xml:space="preserve">of relational &amp; NoSQL graph databases.</w:t>
+      </w:r>
+      <w:r>
+        <w:t xml:space="preserve"> </w:t>
+      </w:r>
+      <w:r>
+        <w:rPr>
+          <w:i/>
+          <w:iCs/>
+        </w:rPr>
+        <w:t xml:space="preserve">International Journal of Advanced Computer</w:t>
+      </w:r>
+      <w:r>
+        <w:rPr>
+          <w:i/>
+          <w:iCs/>
+        </w:rPr>
+        <w:t xml:space="preserve"> </w:t>
+      </w:r>
+      <w:r>
+        <w:rPr>
+          <w:i/>
+          <w:iCs/>
+        </w:rPr>
+        <w:t xml:space="preserve">Science and Applications, 8</w:t>
+      </w:r>
+      <w:r>
+        <w:t xml:space="preserve">(5).</w:t>
+      </w:r>
+      <w:r>
+        <w:t xml:space="preserve"> </w:t>
+      </w:r>
+      <w:hyperlink r:id="rId64">
+        <w:r>
+          <w:rPr>
+            <w:rStyle w:val="Hyperlink"/>
+          </w:rPr>
+          <w:t xml:space="preserve">https://doi.org/10.14569/IJACSA.2017.080564</w:t>
+        </w:r>
+      </w:hyperlink>
+    </w:p>
+    <w:p>
+      <w:pPr>
+        <w:pStyle w:val="BodyText"/>
+      </w:pPr>
+      <w:r>
+        <w:t xml:space="preserve">Kiffer, L., Levin, D., &amp; Mislove, A. (2018). Analyzing Ethereum’s smart contract</w:t>
+      </w:r>
+      <w:r>
+        <w:t xml:space="preserve"> </w:t>
+      </w:r>
+      <w:r>
+        <w:t xml:space="preserve">ecosystem.</w:t>
+      </w:r>
+      <w:r>
+        <w:t xml:space="preserve"> </w:t>
+      </w:r>
+      <w:r>
+        <w:rPr>
+          <w:i/>
+          <w:iCs/>
+        </w:rPr>
+        <w:t xml:space="preserve">Proceedings of the Internet Measurement Conference 2018</w:t>
+      </w:r>
+      <w:r>
+        <w:t xml:space="preserve">, 490–496.</w:t>
+      </w:r>
+    </w:p>
+    <w:p>
+      <w:pPr>
+        <w:pStyle w:val="BodyText"/>
+      </w:pPr>
+      <w:r>
+        <w:t xml:space="preserve">Lin, D., Wu, J., Yuan, Q., &amp; Zheng, Z. (2020). Modeling and understanding Ethereum</w:t>
+      </w:r>
+      <w:r>
+        <w:t xml:space="preserve"> </w:t>
+      </w:r>
+      <w:r>
+        <w:t xml:space="preserve">transaction records via a complex network approach.</w:t>
+      </w:r>
+      <w:r>
+        <w:t xml:space="preserve"> </w:t>
+      </w:r>
+      <w:r>
+        <w:rPr>
+          <w:i/>
+          <w:iCs/>
+        </w:rPr>
+        <w:t xml:space="preserve">IEEE Transactions on Circuits</w:t>
+      </w:r>
+      <w:r>
+        <w:rPr>
+          <w:i/>
+          <w:iCs/>
+        </w:rPr>
+        <w:t xml:space="preserve"> </w:t>
+      </w:r>
+      <w:r>
+        <w:rPr>
+          <w:i/>
+          <w:iCs/>
+        </w:rPr>
+        <w:t xml:space="preserve">and Systems II: Express Briefs, 67</w:t>
+      </w:r>
+      <w:r>
+        <w:t xml:space="preserve">(11), 2737–2741.</w:t>
+      </w:r>
+      <w:r>
+        <w:t xml:space="preserve"> </w:t>
+      </w:r>
+      <w:hyperlink r:id="rId65">
+        <w:r>
+          <w:rPr>
+            <w:rStyle w:val="Hyperlink"/>
+          </w:rPr>
+          <w:t xml:space="preserve">https://doi.org/10.1109/TCSII.2020.2968376</w:t>
+        </w:r>
+      </w:hyperlink>
+    </w:p>
+    <w:p>
+      <w:pPr>
+        <w:pStyle w:val="BodyText"/>
+      </w:pPr>
+      <w:r>
+        <w:t xml:space="preserve">Said, A., Janjua, M. U., Hassan, S., Muzammal, Z., Saleem, T., Thaipisutikul, T.,</w:t>
+      </w:r>
+      <w:r>
+        <w:t xml:space="preserve"> </w:t>
+      </w:r>
+      <w:r>
+        <w:t xml:space="preserve">Tuarob, S., &amp; Nawaz, R. (2021). Detailed analysis of Ethereum network on transaction</w:t>
+      </w:r>
+      <w:r>
+        <w:t xml:space="preserve"> </w:t>
+      </w:r>
+      <w:r>
+        <w:t xml:space="preserve">behavior, community structure and link prediction.</w:t>
+      </w:r>
+      <w:r>
+        <w:t xml:space="preserve"> </w:t>
+      </w:r>
+      <w:r>
+        <w:rPr>
+          <w:i/>
+          <w:iCs/>
+        </w:rPr>
+        <w:t xml:space="preserve">PeerJ Computer Science, 7</w:t>
+      </w:r>
+      <w:r>
+        <w:t xml:space="preserve">, e815.</w:t>
+      </w:r>
+      <w:r>
+        <w:t xml:space="preserve"> </w:t>
+      </w:r>
+      <w:hyperlink r:id="rId66">
+        <w:r>
+          <w:rPr>
+            <w:rStyle w:val="Hyperlink"/>
+          </w:rPr>
+          <w:t xml:space="preserve">https://doi.org/10.7717/peerj-cs.815</w:t>
+        </w:r>
+      </w:hyperlink>
+    </w:p>
+    <w:p>
+      <w:pPr>
+        <w:pStyle w:val="BodyText"/>
+      </w:pPr>
+      <w:r>
+        <w:t xml:space="preserve">Tamilmani, K., &amp; Stefanakis, E. (2019). Modelling and analysis of semantically</w:t>
+      </w:r>
+      <w:r>
+        <w:t xml:space="preserve"> </w:t>
+      </w:r>
+      <w:r>
+        <w:t xml:space="preserve">enriched simplified trajectories using graph databases.</w:t>
+      </w:r>
+      <w:r>
+        <w:t xml:space="preserve"> </w:t>
+      </w:r>
+      <w:r>
+        <w:rPr>
+          <w:i/>
+          <w:iCs/>
+        </w:rPr>
+        <w:t xml:space="preserve">ISPRS International Journal</w:t>
+      </w:r>
+      <w:r>
+        <w:rPr>
+          <w:i/>
+          <w:iCs/>
+        </w:rPr>
+        <w:t xml:space="preserve"> </w:t>
+      </w:r>
+      <w:r>
+        <w:rPr>
+          <w:i/>
+          <w:iCs/>
+        </w:rPr>
+        <w:t xml:space="preserve">of Geo-Information</w:t>
+      </w:r>
+      <w:r>
+        <w:t xml:space="preserve"> </w:t>
+      </w:r>
+      <w:r>
+        <w:t xml:space="preserve">(Advances in Cartography and GIScience of the ICA, Vol. 1), 20.</w:t>
+      </w:r>
+      <w:r>
+        <w:t xml:space="preserve"> </w:t>
+      </w:r>
+      <w:hyperlink r:id="rId67">
+        <w:r>
+          <w:rPr>
+            <w:rStyle w:val="Hyperlink"/>
+          </w:rPr>
+          <w:t xml:space="preserve">https://doi.org/10.5194/ica-adv-1-20-2019</w:t>
+        </w:r>
+      </w:hyperlink>
+    </w:p>
+    <w:p>
+      <w:pPr>
+        <w:pStyle w:val="BodyText"/>
+      </w:pPr>
+      <w:r>
+        <w:t xml:space="preserve">Tschorsch, F., &amp; Scheuermann, B. (2016). Bitcoin and beyond: A technical survey on</w:t>
+      </w:r>
+      <w:r>
+        <w:t xml:space="preserve"> </w:t>
+      </w:r>
+      <w:r>
+        <w:t xml:space="preserve">decentralized digital currencies.</w:t>
+      </w:r>
+      <w:r>
+        <w:t xml:space="preserve"> </w:t>
+      </w:r>
+      <w:r>
+        <w:rPr>
+          <w:i/>
+          <w:iCs/>
+        </w:rPr>
+        <w:t xml:space="preserve">IEEE Communications Surveys &amp; Tutorials, 18</w:t>
+      </w:r>
+      <w:r>
+        <w:t xml:space="preserve">(3),</w:t>
+      </w:r>
+      <w:r>
+        <w:t xml:space="preserve"> </w:t>
+      </w:r>
+      <w:r>
+        <w:t xml:space="preserve">2084–2123.</w:t>
+      </w:r>
+      <w:r>
+        <w:t xml:space="preserve"> </w:t>
+      </w:r>
+      <w:hyperlink r:id="rId68">
+        <w:r>
+          <w:rPr>
+            <w:rStyle w:val="Hyperlink"/>
+          </w:rPr>
+          <w:t xml:space="preserve">https://doi.org/10.1109/COMST.2016.2535718</w:t>
+        </w:r>
+      </w:hyperlink>
+    </w:p>
+    <w:p>
+      <w:pPr>
+        <w:pStyle w:val="BodyText"/>
+      </w:pPr>
+      <w:r>
+        <w:t xml:space="preserve">Victor, F. (2019). Address clustering heuristics for Ethereum. In</w:t>
+      </w:r>
+      <w:r>
+        <w:t xml:space="preserve"> </w:t>
+      </w:r>
+      <w:r>
+        <w:rPr>
+          <w:i/>
+          <w:iCs/>
+        </w:rPr>
+        <w:t xml:space="preserve">Financial</w:t>
+      </w:r>
+      <w:r>
+        <w:rPr>
+          <w:i/>
+          <w:iCs/>
+        </w:rPr>
+        <w:t xml:space="preserve"> </w:t>
+      </w:r>
+      <w:r>
+        <w:rPr>
+          <w:i/>
+          <w:iCs/>
+        </w:rPr>
+        <w:t xml:space="preserve">Cryptography and Data Security (FC 2019)</w:t>
+      </w:r>
+      <w:r>
+        <w:t xml:space="preserve">. Springer.</w:t>
+      </w:r>
+    </w:p>
+    <w:p>
+      <w:pPr>
+        <w:pStyle w:val="BodyText"/>
+      </w:pPr>
+      <w:r>
+        <w:t xml:space="preserve">Victor, F., &amp; Weintraud, A. M. (2021). Detecting and quantifying wash trading on</w:t>
+      </w:r>
+      <w:r>
+        <w:t xml:space="preserve"> </w:t>
+      </w:r>
+      <w:r>
+        <w:t xml:space="preserve">decentralized cryptocurrency exchanges.</w:t>
+      </w:r>
+      <w:r>
+        <w:t xml:space="preserve"> </w:t>
+      </w:r>
+      <w:r>
+        <w:rPr>
+          <w:i/>
+          <w:iCs/>
+        </w:rPr>
+        <w:t xml:space="preserve">arXiv preprint</w:t>
+      </w:r>
+      <w:r>
+        <w:t xml:space="preserve"> </w:t>
+      </w:r>
+      <w:r>
+        <w:t xml:space="preserve">arXiv:2102.07001.</w:t>
+      </w:r>
+    </w:p>
+    <w:p>
+      <w:pPr>
+        <w:pStyle w:val="BodyText"/>
+      </w:pPr>
+      <w:r>
+        <w:t xml:space="preserve">Xue, C., Zhang, T., Xu, Y., &amp; Su, F. (2022). An ocean current-oriented graph-based</w:t>
+      </w:r>
+      <w:r>
+        <w:t xml:space="preserve"> </w:t>
+      </w:r>
+      <w:r>
+        <w:t xml:space="preserve">model for representing Argo trajectories.</w:t>
+      </w:r>
+      <w:r>
+        <w:t xml:space="preserve"> </w:t>
+      </w:r>
+      <w:r>
+        <w:rPr>
+          <w:i/>
+          <w:iCs/>
+        </w:rPr>
+        <w:t xml:space="preserve">Computers &amp; Geosciences, 168</w:t>
+      </w:r>
+      <w:r>
+        <w:t xml:space="preserve">, 105143.</w:t>
+      </w:r>
+      <w:r>
+        <w:t xml:space="preserve"> </w:t>
+      </w:r>
+      <w:hyperlink r:id="rId69">
+        <w:r>
+          <w:rPr>
+            <w:rStyle w:val="Hyperlink"/>
+          </w:rPr>
+          <w:t xml:space="preserve">https://doi.org/10.1016/j.cageo.2022.105143</w:t>
+        </w:r>
+      </w:hyperlink>
+    </w:p>
+    <w:p>
+      <w:pPr>
+        <w:pStyle w:val="BodyText"/>
+      </w:pPr>
+      <w:r>
         <w:t xml:space="preserve">Data source:</w:t>
       </w:r>
       <w:r>
@@ -5408,8 +6690,8 @@
         <w:t xml:space="preserve">ETL), used for all data acquisition in Section 4.</w:t>
       </w:r>
     </w:p>
-    <w:bookmarkEnd w:id="50"/>
-    <w:bookmarkStart w:id="57" w:name="appendix-a-result-tables"/>
+    <w:bookmarkEnd w:id="70"/>
+    <w:bookmarkStart w:id="77" w:name="appendix-a-result-tables"/>
     <w:p>
       <w:pPr>
         <w:pStyle w:val="Heading2"/>
@@ -5461,7 +6743,7 @@
         <w:t xml:space="preserve">The ETH totals in Tables A.1 and A.6 sum external-transaction value and internal-transaction amount over incoming edges, so ETH forwarded through a contract may be counted at more than one hop; these tables are intended for ranking, not exact fund accounting.</w:t>
       </w:r>
     </w:p>
-    <w:bookmarkStart w:id="51" w:name="X214d4ec02ec74041553deb549fd11790b2703f8"/>
+    <w:bookmarkStart w:id="71" w:name="X214d4ec02ec74041553deb549fd11790b2703f8"/>
     <w:p>
       <w:pPr>
         <w:pStyle w:val="Heading3"/>
@@ -6147,8 +7429,8 @@
         </w:tc>
       </w:tr>
     </w:tbl>
-    <w:bookmarkEnd w:id="51"/>
-    <w:bookmarkStart w:id="52" w:name="X5863678dbf673f417b0f3fae876c6fc79abdeac"/>
+    <w:bookmarkEnd w:id="71"/>
+    <w:bookmarkStart w:id="72" w:name="X5863678dbf673f417b0f3fae876c6fc79abdeac"/>
     <w:p>
       <w:pPr>
         <w:pStyle w:val="Heading3"/>
@@ -6845,8 +8127,8 @@
         </w:tc>
       </w:tr>
     </w:tbl>
-    <w:bookmarkEnd w:id="52"/>
-    <w:bookmarkStart w:id="53" w:name="X7d84aa2e0b2b54693ba43a4ccbab22deed22e9e"/>
+    <w:bookmarkEnd w:id="72"/>
+    <w:bookmarkStart w:id="73" w:name="X7d84aa2e0b2b54693ba43a4ccbab22deed22e9e"/>
     <w:p>
       <w:pPr>
         <w:pStyle w:val="Heading3"/>
@@ -7476,8 +8758,8 @@
         </w:tc>
       </w:tr>
     </w:tbl>
-    <w:bookmarkEnd w:id="53"/>
-    <w:bookmarkStart w:id="54" w:name="X145395819cc267584b954e33b6206b843e06e16"/>
+    <w:bookmarkEnd w:id="73"/>
+    <w:bookmarkStart w:id="74" w:name="X145395819cc267584b954e33b6206b843e06e16"/>
     <w:p>
       <w:pPr>
         <w:pStyle w:val="Heading3"/>
@@ -8107,8 +9389,8 @@
         </w:tc>
       </w:tr>
     </w:tbl>
-    <w:bookmarkEnd w:id="54"/>
-    <w:bookmarkStart w:id="55" w:name="X8aa201537f882d17bb999ec593b8110b2f44bac"/>
+    <w:bookmarkEnd w:id="74"/>
+    <w:bookmarkStart w:id="75" w:name="X8aa201537f882d17bb999ec593b8110b2f44bac"/>
     <w:p>
       <w:pPr>
         <w:pStyle w:val="Heading3"/>
@@ -8795,8 +10077,8 @@
         </w:tc>
       </w:tr>
     </w:tbl>
-    <w:bookmarkEnd w:id="55"/>
-    <w:bookmarkStart w:id="56" w:name="X82d7506a9cdc605ac13e50261740acac4f65c3d"/>
+    <w:bookmarkEnd w:id="75"/>
+    <w:bookmarkStart w:id="76" w:name="X82d7506a9cdc605ac13e50261740acac4f65c3d"/>
     <w:p>
       <w:pPr>
         <w:pStyle w:val="Heading3"/>
@@ -9171,9 +10453,9 @@
         </w:tc>
       </w:tr>
     </w:tbl>
-    <w:bookmarkEnd w:id="56"/>
-    <w:bookmarkEnd w:id="57"/>
-    <w:bookmarkEnd w:id="58"/>
+    <w:bookmarkEnd w:id="76"/>
+    <w:bookmarkEnd w:id="77"/>
+    <w:bookmarkEnd w:id="78"/>
     <w:sectPr>
       <w:footnotePr>
         <w:numRestart w:val="eachSect"/>

</xml_diff>

<commit_message>
paper: redraw model figures (1-3) with fixed-layout matplotlib to match the original manuscript diagrams (no balance, per §3.3)
</commit_message>
<xml_diff>
--- a/docs/paper/paper_v2.docx
+++ b/docs/paper/paper_v2.docx
@@ -1503,7 +1503,7 @@
       <w:r>
         <w:drawing>
           <wp:inline>
-            <wp:extent cx="5334000" cy="1034698"/>
+            <wp:extent cx="5334000" cy="2184588"/>
             <wp:effectExtent b="0" l="0" r="0" t="0"/>
             <wp:docPr descr="Figure 1. External and internal transactions. An external transaction, initiated by an EOA and addressed to another account or to a smart contract, may trigger a cascade of internal transactions during contract execution." title="" id="16" name="Picture"/>
             <a:graphic>
@@ -1524,7 +1524,7 @@
                   <pic:spPr bwMode="auto">
                     <a:xfrm>
                       <a:off x="0" y="0"/>
-                      <a:ext cx="5334000" cy="1034698"/>
+                      <a:ext cx="5334000" cy="2184588"/>
                     </a:xfrm>
                     <a:prstGeom prst="rect">
                       <a:avLst/>
@@ -2089,7 +2089,7 @@
       <w:r>
         <w:drawing>
           <wp:inline>
-            <wp:extent cx="5334000" cy="4327723"/>
+            <wp:extent cx="5334000" cy="2973862"/>
             <wp:effectExtent b="0" l="0" r="0" t="0"/>
             <wp:docPr descr="Figure 2. Structure of blocks and external transactions. Blocks form a trajectory through previous block edges; an external transaction is recorded in its block and linked by sent by / received by to its sender and receiver accounts. Account nodes carry only address and isContract." title="" id="22" name="Picture"/>
             <a:graphic>
@@ -2110,7 +2110,7 @@
                   <pic:spPr bwMode="auto">
                     <a:xfrm>
                       <a:off x="0" y="0"/>
-                      <a:ext cx="5334000" cy="4327723"/>
+                      <a:ext cx="5334000" cy="2973862"/>
                     </a:xfrm>
                     <a:prstGeom prst="rect">
                       <a:avLst/>
@@ -2231,7 +2231,7 @@
       <w:r>
         <w:drawing>
           <wp:inline>
-            <wp:extent cx="5334000" cy="4824145"/>
+            <wp:extent cx="5334000" cy="2971617"/>
             <wp:effectExtent b="0" l="0" r="0" t="0"/>
             <wp:docPr descr="Figure 3. Relationship between external and internal transactions. An external transaction triggers internal transactions (keyed by parentTransactionHash and sequenceId), each linked by internal sent by / internal received by to its own sender and receiver accounts." title="" id="25" name="Picture"/>
             <a:graphic>
@@ -2252,7 +2252,7 @@
                   <pic:spPr bwMode="auto">
                     <a:xfrm>
                       <a:off x="0" y="0"/>
-                      <a:ext cx="5334000" cy="4824145"/>
+                      <a:ext cx="5334000" cy="2971617"/>
                     </a:xfrm>
                     <a:prstGeom prst="rect">
                       <a:avLst/>

</xml_diff>

<commit_message>
paper: redraw Figure 1 with icon style (person/document, block arrows) matching original; regenerate docx without TOC field
</commit_message>
<xml_diff>
--- a/docs/paper/paper_v2.docx
+++ b/docs/paper/paper_v2.docx
@@ -2,32 +2,6 @@
 <file path=word/document.xml><?xml version="1.0" encoding="utf-8"?>
 <w:document xmlns:w="http://schemas.openxmlformats.org/wordprocessingml/2006/main" xmlns:m="http://schemas.openxmlformats.org/officeDocument/2006/math" xmlns:r="http://schemas.openxmlformats.org/officeDocument/2006/relationships" xmlns:o="urn:schemas-microsoft-com:office:office" xmlns:v="urn:schemas-microsoft-com:vml" xmlns:w10="urn:schemas-microsoft-com:office:word" xmlns:a="http://schemas.openxmlformats.org/drawingml/2006/main" xmlns:pic="http://schemas.openxmlformats.org/drawingml/2006/picture" xmlns:wp="http://schemas.openxmlformats.org/drawingml/2006/wordprocessingDrawing">
   <w:body>
-    <w:sdt>
-      <w:sdtPr>
-        <w:docPartObj>
-          <w:docPartGallery w:val="Table of Contents"/>
-          <w:docPartUnique/>
-        </w:docPartObj>
-      </w:sdtPr>
-      <w:sdtContent>
-        <w:p>
-          <w:pPr>
-            <w:pStyle w:val="TOCHeading"/>
-          </w:pPr>
-          <w:r>
-            <w:t xml:space="preserve">Table of Contents</w:t>
-          </w:r>
-        </w:p>
-        <w:p>
-          <w:r>
-            <w:fldChar w:fldCharType="begin" w:dirty="true"/>
-            <w:instrText xml:space="preserve">TOC \o "1-3" \h \z \u</w:instrText>
-            <w:fldChar w:fldCharType="separate"/>
-            <w:fldChar w:fldCharType="end"/>
-          </w:r>
-        </w:p>
-      </w:sdtContent>
-    </w:sdt>
     <w:bookmarkStart w:id="78" w:name="X63549e08055b657ccf82a95e21665ce445d9073"/>
     <w:p>
       <w:pPr>
@@ -1503,7 +1477,7 @@
       <w:r>
         <w:drawing>
           <wp:inline>
-            <wp:extent cx="5334000" cy="2184588"/>
+            <wp:extent cx="5334000" cy="2712395"/>
             <wp:effectExtent b="0" l="0" r="0" t="0"/>
             <wp:docPr descr="Figure 1. External and internal transactions. An external transaction, initiated by an EOA and addressed to another account or to a smart contract, may trigger a cascade of internal transactions during contract execution." title="" id="16" name="Picture"/>
             <a:graphic>
@@ -1524,7 +1498,7 @@
                   <pic:spPr bwMode="auto">
                     <a:xfrm>
                       <a:off x="0" y="0"/>
-                      <a:ext cx="5334000" cy="2184588"/>
+                      <a:ext cx="5334000" cy="2712395"/>
                     </a:xfrm>
                     <a:prstGeom prst="rect">
                       <a:avLst/>

</xml_diff>